<commit_message>
fix: separate signing blocks in all agreements
</commit_message>
<xml_diff>
--- a/templates/dda.docx
+++ b/templates/dda.docx
@@ -324,70 +324,202 @@
     </w:p>
     <w:p>
       <w:pPr>
-        <w:pStyle w:val="Heading1"/>
-      </w:pPr>
-      <w:r>
+        <w:pStyle w:val="Normal"/>
+        <w:keepNext w:val="1"/>
+        <w:keepLines/>
+        <w:ind w:left="0" w:right="0" w:firstLine="0"/>
+        <w:spacing w:before="360" w:after="100" w:line="264" w:lineRule="auto"/>
+        <w:jc w:val="left"/>
+      </w:pPr>
+      <w:r>
+        <w:rPr>
+          <w:rFonts w:ascii="Calibri" w:hAnsi="Calibri" w:cs="Calibri"/>
+          <w:b w:val="1"/>
+          <w:color w:val="1F5FFF"/>
+          <w:sz w:val="22"/>
+          <w:szCs w:val="22"/>
+        </w:rPr>
         <w:t xml:space="preserve">For {providerName}</w:t>
       </w:r>
     </w:p>
     <w:p>
       <w:pPr>
         <w:pStyle w:val="Normal"/>
-        <w:keepNext/>
-      </w:pPr>
-      <w:r>
+        <w:keepNext w:val="1"/>
+        <w:keepLines/>
+        <w:ind w:left="0" w:right="0" w:firstLine="0"/>
+        <w:spacing w:before="0" w:after="100" w:line="264" w:lineRule="auto"/>
+        <w:jc w:val="left"/>
+      </w:pPr>
+      <w:r>
+        <w:rPr>
+          <w:rFonts w:ascii="Calibri" w:hAnsi="Calibri" w:cs="Calibri"/>
+          <w:b w:val="0"/>
+          <w:color w:val="172038"/>
+          <w:sz w:val="22"/>
+          <w:szCs w:val="22"/>
+        </w:rPr>
         <w:t xml:space="preserve">Authorized signatory: {providerSignatory}</w:t>
       </w:r>
     </w:p>
     <w:p>
       <w:pPr>
         <w:pStyle w:val="Normal"/>
-        <w:keepNext/>
-      </w:pPr>
-      <w:r>
+        <w:keepNext w:val="1"/>
+        <w:keepLines/>
+        <w:ind w:left="0" w:right="0" w:firstLine="0"/>
+        <w:spacing w:before="0" w:after="100" w:line="264" w:lineRule="auto"/>
+        <w:jc w:val="left"/>
+      </w:pPr>
+      <w:r>
+        <w:rPr>
+          <w:rFonts w:ascii="Calibri" w:hAnsi="Calibri" w:cs="Calibri"/>
+          <w:b w:val="0"/>
+          <w:color w:val="172038"/>
+          <w:sz w:val="22"/>
+          <w:szCs w:val="22"/>
+        </w:rPr>
         <w:t xml:space="preserve">Title: {providerDesignation}</w:t>
       </w:r>
     </w:p>
     <w:p>
       <w:pPr>
         <w:pStyle w:val="Normal"/>
-      </w:pPr>
-      <w:r>
-        <w:t xml:space="preserve">Signature: ______________________________    Date signed: __________________</w:t>
-      </w:r>
-    </w:p>
-    <w:p>
-      <w:pPr>
-        <w:pStyle w:val="Heading1"/>
-      </w:pPr>
-      <w:r>
+        <w:keepNext w:val="1"/>
+        <w:keepLines/>
+        <w:ind w:left="0" w:right="0" w:firstLine="0"/>
+        <w:spacing w:before="360" w:after="100" w:line="264" w:lineRule="auto"/>
+        <w:jc w:val="left"/>
+      </w:pPr>
+      <w:r>
+        <w:rPr>
+          <w:rFonts w:ascii="Calibri" w:hAnsi="Calibri" w:cs="Calibri"/>
+          <w:b w:val="0"/>
+          <w:color w:val="172038"/>
+          <w:sz w:val="22"/>
+          <w:szCs w:val="22"/>
+        </w:rPr>
+        <w:t xml:space="preserve">Signature: ______________________________</w:t>
+      </w:r>
+    </w:p>
+    <w:p>
+      <w:pPr>
+        <w:pStyle w:val="Normal"/>
+        <w:keepNext w:val="0"/>
+        <w:keepLines/>
+        <w:ind w:left="0" w:right="0" w:firstLine="0"/>
+        <w:spacing w:before="0" w:after="360" w:line="264" w:lineRule="auto"/>
+        <w:jc w:val="left"/>
+      </w:pPr>
+      <w:r>
+        <w:rPr>
+          <w:rFonts w:ascii="Calibri" w:hAnsi="Calibri" w:cs="Calibri"/>
+          <w:b w:val="0"/>
+          <w:color w:val="172038"/>
+          <w:sz w:val="22"/>
+          <w:szCs w:val="22"/>
+        </w:rPr>
+        <w:t xml:space="preserve">Date signed: ____________________________</w:t>
+      </w:r>
+    </w:p>
+    <w:p>
+      <w:pPr>
+        <w:pStyle w:val="Normal"/>
+        <w:keepNext w:val="1"/>
+        <w:keepLines/>
+        <w:ind w:left="0" w:right="0" w:firstLine="0"/>
+        <w:spacing w:before="360" w:after="100" w:line="264" w:lineRule="auto"/>
+        <w:jc w:val="left"/>
+      </w:pPr>
+      <w:r>
+        <w:rPr>
+          <w:rFonts w:ascii="Calibri" w:hAnsi="Calibri" w:cs="Calibri"/>
+          <w:b w:val="1"/>
+          <w:color w:val="1F5FFF"/>
+          <w:sz w:val="22"/>
+          <w:szCs w:val="22"/>
+        </w:rPr>
         <w:t xml:space="preserve">For {companyFullName}</w:t>
       </w:r>
     </w:p>
     <w:p>
       <w:pPr>
         <w:pStyle w:val="Normal"/>
-        <w:keepNext/>
-      </w:pPr>
-      <w:r>
+        <w:keepNext w:val="1"/>
+        <w:keepLines/>
+        <w:ind w:left="0" w:right="0" w:firstLine="0"/>
+        <w:spacing w:before="0" w:after="100" w:line="264" w:lineRule="auto"/>
+        <w:jc w:val="left"/>
+      </w:pPr>
+      <w:r>
+        <w:rPr>
+          <w:rFonts w:ascii="Calibri" w:hAnsi="Calibri" w:cs="Calibri"/>
+          <w:b w:val="0"/>
+          <w:color w:val="172038"/>
+          <w:sz w:val="22"/>
+          <w:szCs w:val="22"/>
+        </w:rPr>
         <w:t xml:space="preserve">Authorized signatory: {clientName}</w:t>
       </w:r>
     </w:p>
     <w:p>
       <w:pPr>
         <w:pStyle w:val="Normal"/>
-        <w:keepNext/>
-      </w:pPr>
-      <w:r>
+        <w:keepNext w:val="1"/>
+        <w:keepLines/>
+        <w:ind w:left="0" w:right="0" w:firstLine="0"/>
+        <w:spacing w:before="0" w:after="100" w:line="264" w:lineRule="auto"/>
+        <w:jc w:val="left"/>
+      </w:pPr>
+      <w:r>
+        <w:rPr>
+          <w:rFonts w:ascii="Calibri" w:hAnsi="Calibri" w:cs="Calibri"/>
+          <w:b w:val="0"/>
+          <w:color w:val="172038"/>
+          <w:sz w:val="22"/>
+          <w:szCs w:val="22"/>
+        </w:rPr>
         <w:t xml:space="preserve">Title: {clientDesignation}</w:t>
       </w:r>
     </w:p>
     <w:p>
       <w:pPr>
         <w:pStyle w:val="Normal"/>
-      </w:pPr>
-      <w:r>
-        <w:t xml:space="preserve">Signature: ______________________________    Date signed: __________________</w:t>
+        <w:keepNext w:val="1"/>
+        <w:keepLines/>
+        <w:ind w:left="0" w:right="0" w:firstLine="0"/>
+        <w:spacing w:before="360" w:after="100" w:line="264" w:lineRule="auto"/>
+        <w:jc w:val="left"/>
+      </w:pPr>
+      <w:r>
+        <w:rPr>
+          <w:rFonts w:ascii="Calibri" w:hAnsi="Calibri" w:cs="Calibri"/>
+          <w:b w:val="0"/>
+          <w:color w:val="172038"/>
+          <w:sz w:val="22"/>
+          <w:szCs w:val="22"/>
+        </w:rPr>
+        <w:t xml:space="preserve">Signature: ______________________________</w:t>
+      </w:r>
+    </w:p>
+    <w:p>
+      <w:pPr>
+        <w:pStyle w:val="Normal"/>
+        <w:keepNext w:val="0"/>
+        <w:keepLines/>
+        <w:ind w:left="0" w:right="0" w:firstLine="0"/>
+        <w:spacing w:before="0" w:after="360" w:line="264" w:lineRule="auto"/>
+        <w:jc w:val="left"/>
+      </w:pPr>
+      <w:r>
+        <w:rPr>
+          <w:rFonts w:ascii="Calibri" w:hAnsi="Calibri" w:cs="Calibri"/>
+          <w:b w:val="0"/>
+          <w:color w:val="172038"/>
+          <w:sz w:val="22"/>
+          <w:szCs w:val="22"/>
+        </w:rPr>
+        <w:t xml:space="preserve">Date signed: ____________________________</w:t>
       </w:r>
     </w:p>
     <w:sectPr>

</xml_diff>